<commit_message>
Update documentation and scripts: Modify design document to include additional files and operational steps, enhance Word document generation script with new header and footer functionalities, and remove obsolete Word document. Adjust markdown content handling to support image inclusion in generated documents.
</commit_message>
<xml_diff>
--- a/docs/word/MICP软著补正补充说明.docx
+++ b/docs/word/MICP软著补正补充说明.docx
@@ -764,7 +764,7 @@
                 <w:b w:val="0"/>
                 <w:sz w:val="21"/>
               </w:rPr>
-              <w:t>圆柱试样 Φ39.1 mm × 80 mm，体积取 96 cm³；利用率由孔隙体积与胶结液体积之比裁剪到 0.35～1</w:t>
+              <w:t>圆柱试样直径 39.1 mm、高 80 mm，体积取 96 cm³；利用率由孔隙体积与胶结液体积之比裁剪到 0.35～1</w:t>
             </w:r>
           </w:p>
         </w:tc>
@@ -784,7 +784,7 @@
                 <w:b w:val="0"/>
                 <w:sz w:val="21"/>
               </w:rPr>
-              <w:t>该直径和高度是国内三轴试验常用试样尺寸，试验方法见 GB/T 50123—2019[8]</w:t>
+              <w:t>39.1 mm 是 GB/T 50123—2019 规定的三轴试样直径之一，80 mm 对应的高径比约 2.05，落在 2.0～2.5 内[8]</w:t>
             </w:r>
           </w:p>
         </w:tc>
@@ -846,7 +846,7 @@
                 <w:b w:val="0"/>
                 <w:sz w:val="21"/>
               </w:rPr>
-              <w:t>Al Qabany 等观察到注入速率和浓度会改变化学效率与孔隙中的沉淀分布[3]。0.75 和 1.8 是本软件系数</w:t>
+              <w:t>Al Qabany 等观察到注入速率过高时化学效率下降，浓度主要改变孔隙中的沉淀分布[3]。0.75 和 1.8 是本软件系数</w:t>
             </w:r>
           </w:p>
         </w:tc>

</xml_diff>